<commit_message>
docs: optimize architecture diagram layout in PDF and embed GitHub links across all pages
</commit_message>
<xml_diff>
--- a/review2_submission/Review_2_Smart_Hospital.docx
+++ b/review2_submission/Review_2_Smart_Hospital.docx
@@ -5959,10 +5959,44 @@
     </w:p>
     <w:p>
       <w:pPr>
+        <w:pStyle w:val="Heading2"/>
+        <w:spacing w:before="280" w:after="120"/>
+      </w:pPr>
+      <w:r>
+        <w:t>10.1 Modular Architecture &amp; Separation of Concerns</w:t>
+      </w:r>
+    </w:p>
+    <w:p>
+      <w:pPr>
         <w:spacing w:after="120" w:line="276" w:lineRule="auto"/>
       </w:pPr>
       <w:r>
         <w:t>The codebase adheres to industry-standard modular design principles. Separation of concerns is maintained across routes, controllers, Mongoose schemas, and Neo4j services. Environment variables are managed through .env and .env.example, preventing hardcoded credentials.</w:t>
+      </w:r>
+    </w:p>
+    <w:p>
+      <w:pPr>
+        <w:pStyle w:val="Heading2"/>
+        <w:spacing w:before="280" w:after="120"/>
+      </w:pPr>
+      <w:r>
+        <w:t>10.2 Version Control &amp; Official GitHub Repository</w:t>
+      </w:r>
+    </w:p>
+    <w:p>
+      <w:pPr>
+        <w:spacing w:after="120" w:line="276" w:lineRule="auto"/>
+      </w:pPr>
+      <w:r>
+        <w:t>The complete source code, automated test suite, database dumps, and documentation are publicly hosted on GitHub:</w:t>
+        <w:br/>
+        <w:t>• Repository: https://github.com/dadhanianisarg/Smart-Hospital-Information-System</w:t>
+        <w:br/>
+        <w:t>• Default Branch: main</w:t>
+        <w:br/>
+        <w:t>• Visibility: Public (Academic Open Source)</w:t>
+        <w:br/>
+        <w:t>• Clone Command: git clone https://github.com/dadhanianisarg/Smart-Hospital-Information-System.git</w:t>
       </w:r>
     </w:p>
     <w:p>
@@ -6777,6 +6811,84 @@
                 <w:sz w:val="16"/>
               </w:rPr>
               <w:t>server/tests/api.test.js</w:t>
+            </w:r>
+          </w:p>
+        </w:tc>
+        <w:tc>
+          <w:tcPr>
+            <w:tcW w:type="dxa" w:w="2520"/>
+            <w:tcMar>
+              <w:top w:w="50" w:type="dxa"/>
+              <w:bottom w:w="50" w:type="dxa"/>
+              <w:left w:w="80" w:type="dxa"/>
+              <w:right w:w="80" w:type="dxa"/>
+            </w:tcMar>
+          </w:tcPr>
+          <w:p>
+            <w:r>
+              <w:rPr>
+                <w:sz w:val="16"/>
+              </w:rPr>
+              <w:t>COMPLETED (PASS)</w:t>
+            </w:r>
+          </w:p>
+        </w:tc>
+      </w:tr>
+      <w:tr>
+        <w:tc>
+          <w:tcPr>
+            <w:tcW w:type="dxa" w:w="2520"/>
+            <w:tcMar>
+              <w:top w:w="50" w:type="dxa"/>
+              <w:bottom w:w="50" w:type="dxa"/>
+              <w:left w:w="80" w:type="dxa"/>
+              <w:right w:w="80" w:type="dxa"/>
+            </w:tcMar>
+          </w:tcPr>
+          <w:p>
+            <w:r>
+              <w:rPr>
+                <w:sz w:val="16"/>
+              </w:rPr>
+              <w:t>Source Code &amp; GitHub</w:t>
+            </w:r>
+          </w:p>
+        </w:tc>
+        <w:tc>
+          <w:tcPr>
+            <w:tcW w:type="dxa" w:w="2520"/>
+            <w:tcMar>
+              <w:top w:w="50" w:type="dxa"/>
+              <w:bottom w:w="50" w:type="dxa"/>
+              <w:left w:w="80" w:type="dxa"/>
+              <w:right w:w="80" w:type="dxa"/>
+            </w:tcMar>
+          </w:tcPr>
+          <w:p>
+            <w:r>
+              <w:rPr>
+                <w:sz w:val="16"/>
+              </w:rPr>
+              <w:t>Public repository with atomic commit history</w:t>
+            </w:r>
+          </w:p>
+        </w:tc>
+        <w:tc>
+          <w:tcPr>
+            <w:tcW w:type="dxa" w:w="2520"/>
+            <w:tcMar>
+              <w:top w:w="50" w:type="dxa"/>
+              <w:bottom w:w="50" w:type="dxa"/>
+              <w:left w:w="80" w:type="dxa"/>
+              <w:right w:w="80" w:type="dxa"/>
+            </w:tcMar>
+          </w:tcPr>
+          <w:p>
+            <w:r>
+              <w:rPr>
+                <w:sz w:val="16"/>
+              </w:rPr>
+              <w:t>github.com/dadhanianisarg/Smart-Hospital...</w:t>
             </w:r>
           </w:p>
         </w:tc>

</xml_diff>